<commit_message>
Add equal work distribution to FinSight report
</commit_message>
<xml_diff>
--- a/reports/Bao_cao_do_an_FinSight_AI.docx
+++ b/reports/Bao_cao_do_an_FinSight_AI.docx
@@ -2393,6 +2393,546 @@
       </w:pPr>
       <w:r>
         <w:t>README.md; docs/ARCHITECTURE.md; docs/DATABASE_DESIGN.md; docs/XAMPP_MIGRATION.md; docs/AI_MODEL_REPORT.md; docs/AI_CHAT.md; docs/TEST_RESULTS.md. Số liệu mô hình: docs/test-results/ml-training-v2.json. Bằng chứng tích hợp: docs/test-results/chat-deployment.json và chat-browser.json.</w:t>
+      </w:r>
+    </w:p>
+    <w:p>
+      <w:pPr>
+        <w:pStyle w:val="FinBody"/>
+        <w:spacing w:before="0" w:after="0"/>
+      </w:pPr>
+      <w:r>
+        <w:t/>
+      </w:r>
+      <w:r>
+        <w:br w:type="page"/>
+      </w:r>
+    </w:p>
+    <w:p>
+      <w:pPr>
+        <w:pStyle w:val="FinH1"/>
+      </w:pPr>
+      <w:r>
+        <w:t>5 Phân chia công việc</w:t>
+      </w:r>
+    </w:p>
+    <w:p>
+      <w:pPr>
+        <w:pStyle w:val="FinBody"/>
+      </w:pPr>
+      <w:r>
+        <w:t>Nhóm phân chia công việc cho 5 thành viên, mỗi người đảm nhận 20% tổng khối lượng. Nhiệm vụ được phân công theo các phần chính của dự án như bảng dưới đây.</w:t>
+      </w:r>
+    </w:p>
+    <w:tbl>
+      <w:tblPr>
+        <w:tblW w:w="9071" w:type="dxa"/>
+        <w:jc w:val="center"/>
+        <w:tblBorders>
+          <w:top w:val="single" w:sz="4" w:color="D9D9D9"/>
+          <w:left w:val="single" w:sz="4" w:color="D9D9D9"/>
+          <w:bottom w:val="single" w:sz="4" w:color="D9D9D9"/>
+          <w:right w:val="single" w:sz="4" w:color="D9D9D9"/>
+          <w:insideH w:val="single" w:sz="4" w:color="D9D9D9"/>
+          <w:insideV w:val="single" w:sz="4" w:color="D9D9D9"/>
+        </w:tblBorders>
+        <w:tblLayout w:type="fixed"/>
+        <w:tblCellMar>
+          <w:top w:w="110" w:type="dxa"/>
+          <w:bottom w:w="110" w:type="dxa"/>
+          <w:left w:w="110" w:type="dxa"/>
+          <w:right w:w="110" w:type="dxa"/>
+        </w:tblCellMar>
+      </w:tblPr>
+      <w:tblGrid>
+        <w:gridCol w:w="2000"/>
+        <w:gridCol w:w="1250"/>
+        <w:gridCol w:w="4721"/>
+        <w:gridCol w:w="1100"/>
+      </w:tblGrid>
+      <w:tr>
+        <w:trPr>
+          <w:cantSplit/>
+          <w:tblHeader/>
+        </w:trPr>
+        <w:tc>
+          <w:tcPr>
+            <w:tcW w:w="2000" w:type="dxa"/>
+            <w:shd w:fill="E7E6E6"/>
+            <w:vAlign w:val="center"/>
+          </w:tcPr>
+          <w:p>
+            <w:pPr>
+              <w:pStyle w:val="FinCell"/>
+              <w:jc w:val="center"/>
+            </w:pPr>
+            <w:r>
+              <w:rPr>
+                <w:b/>
+              </w:rPr>
+              <w:t>Thành viên</w:t>
+            </w:r>
+          </w:p>
+        </w:tc>
+        <w:tc>
+          <w:tcPr>
+            <w:tcW w:w="1250" w:type="dxa"/>
+            <w:shd w:fill="E7E6E6"/>
+            <w:vAlign w:val="center"/>
+          </w:tcPr>
+          <w:p>
+            <w:pPr>
+              <w:pStyle w:val="FinCell"/>
+              <w:jc w:val="center"/>
+            </w:pPr>
+            <w:r>
+              <w:rPr>
+                <w:b/>
+              </w:rPr>
+              <w:t>MSSV</w:t>
+            </w:r>
+          </w:p>
+        </w:tc>
+        <w:tc>
+          <w:tcPr>
+            <w:tcW w:w="4721" w:type="dxa"/>
+            <w:shd w:fill="E7E6E6"/>
+            <w:vAlign w:val="center"/>
+          </w:tcPr>
+          <w:p>
+            <w:pPr>
+              <w:pStyle w:val="FinCell"/>
+              <w:jc w:val="center"/>
+            </w:pPr>
+            <w:r>
+              <w:rPr>
+                <w:b/>
+              </w:rPr>
+              <w:t>Nhiệm vụ được phân công</w:t>
+            </w:r>
+          </w:p>
+        </w:tc>
+        <w:tc>
+          <w:tcPr>
+            <w:tcW w:w="1100" w:type="dxa"/>
+            <w:shd w:fill="E7E6E6"/>
+            <w:vAlign w:val="center"/>
+          </w:tcPr>
+          <w:p>
+            <w:pPr>
+              <w:pStyle w:val="FinCell"/>
+              <w:jc w:val="center"/>
+            </w:pPr>
+            <w:r>
+              <w:rPr>
+                <w:b/>
+              </w:rPr>
+              <w:t>Tỷ lệ</w:t>
+            </w:r>
+          </w:p>
+        </w:tc>
+      </w:tr>
+      <w:tr>
+        <w:trPr>
+          <w:cantSplit/>
+        </w:trPr>
+        <w:tc>
+          <w:tcPr>
+            <w:tcW w:w="2000" w:type="dxa"/>
+            <w:vAlign w:val="center"/>
+          </w:tcPr>
+          <w:p>
+            <w:pPr>
+              <w:pStyle w:val="FinCell"/>
+            </w:pPr>
+            <w:r>
+              <w:t>Lê Như Đỉnh</w:t>
+            </w:r>
+          </w:p>
+        </w:tc>
+        <w:tc>
+          <w:tcPr>
+            <w:tcW w:w="1250" w:type="dxa"/>
+            <w:vAlign w:val="center"/>
+          </w:tcPr>
+          <w:p>
+            <w:pPr>
+              <w:pStyle w:val="FinCell"/>
+              <w:jc w:val="center"/>
+            </w:pPr>
+            <w:r>
+              <w:t>24ITE125</w:t>
+            </w:r>
+          </w:p>
+        </w:tc>
+        <w:tc>
+          <w:tcPr>
+            <w:tcW w:w="4721" w:type="dxa"/>
+            <w:vAlign w:val="center"/>
+          </w:tcPr>
+          <w:p>
+            <w:pPr>
+              <w:pStyle w:val="FinCell"/>
+            </w:pPr>
+            <w:r>
+              <w:t>Phân tích yêu cầu; thiết kế giao diện React, dashboard và các màn hình quản lý thu chi.</w:t>
+            </w:r>
+          </w:p>
+        </w:tc>
+        <w:tc>
+          <w:tcPr>
+            <w:tcW w:w="1100" w:type="dxa"/>
+            <w:vAlign w:val="center"/>
+          </w:tcPr>
+          <w:p>
+            <w:pPr>
+              <w:pStyle w:val="FinCell"/>
+              <w:jc w:val="center"/>
+            </w:pPr>
+            <w:r>
+              <w:t>20%</w:t>
+            </w:r>
+          </w:p>
+        </w:tc>
+      </w:tr>
+      <w:tr>
+        <w:trPr>
+          <w:cantSplit/>
+        </w:trPr>
+        <w:tc>
+          <w:tcPr>
+            <w:tcW w:w="2000" w:type="dxa"/>
+            <w:vAlign w:val="center"/>
+          </w:tcPr>
+          <w:p>
+            <w:pPr>
+              <w:pStyle w:val="FinCell"/>
+            </w:pPr>
+            <w:r>
+              <w:t>Nguyễn Đức Trí</w:t>
+            </w:r>
+          </w:p>
+        </w:tc>
+        <w:tc>
+          <w:tcPr>
+            <w:tcW w:w="1250" w:type="dxa"/>
+            <w:vAlign w:val="center"/>
+          </w:tcPr>
+          <w:p>
+            <w:pPr>
+              <w:pStyle w:val="FinCell"/>
+              <w:jc w:val="center"/>
+            </w:pPr>
+            <w:r>
+              <w:t>24ITE112</w:t>
+            </w:r>
+          </w:p>
+        </w:tc>
+        <w:tc>
+          <w:tcPr>
+            <w:tcW w:w="4721" w:type="dxa"/>
+            <w:vAlign w:val="center"/>
+          </w:tcPr>
+          <w:p>
+            <w:pPr>
+              <w:pStyle w:val="FinCell"/>
+            </w:pPr>
+            <w:r>
+              <w:t>Thiết kế cơ sở dữ liệu XAMPP; phát triển API Backend, phân quyền và nghiệp vụ ví, giao dịch.</w:t>
+            </w:r>
+          </w:p>
+        </w:tc>
+        <w:tc>
+          <w:tcPr>
+            <w:tcW w:w="1100" w:type="dxa"/>
+            <w:vAlign w:val="center"/>
+          </w:tcPr>
+          <w:p>
+            <w:pPr>
+              <w:pStyle w:val="FinCell"/>
+              <w:jc w:val="center"/>
+            </w:pPr>
+            <w:r>
+              <w:t>20%</w:t>
+            </w:r>
+          </w:p>
+        </w:tc>
+      </w:tr>
+      <w:tr>
+        <w:trPr>
+          <w:cantSplit/>
+        </w:trPr>
+        <w:tc>
+          <w:tcPr>
+            <w:tcW w:w="2000" w:type="dxa"/>
+            <w:vAlign w:val="center"/>
+          </w:tcPr>
+          <w:p>
+            <w:pPr>
+              <w:pStyle w:val="FinCell"/>
+            </w:pPr>
+            <w:r>
+              <w:t>Trần Minh Nhật</w:t>
+            </w:r>
+          </w:p>
+        </w:tc>
+        <w:tc>
+          <w:tcPr>
+            <w:tcW w:w="1250" w:type="dxa"/>
+            <w:vAlign w:val="center"/>
+          </w:tcPr>
+          <w:p>
+            <w:pPr>
+              <w:pStyle w:val="FinCell"/>
+              <w:jc w:val="center"/>
+            </w:pPr>
+            <w:r>
+              <w:t>24ITE071</w:t>
+            </w:r>
+          </w:p>
+        </w:tc>
+        <w:tc>
+          <w:tcPr>
+            <w:tcW w:w="4721" w:type="dxa"/>
+            <w:vAlign w:val="center"/>
+          </w:tcPr>
+          <w:p>
+            <w:pPr>
+              <w:pStyle w:val="FinCell"/>
+            </w:pPr>
+            <w:r>
+              <w:t>Chuẩn bị dữ liệu; huấn luyện và đánh giá mô hình dự báo chi tiêu Random Forest, XGBoost.</w:t>
+            </w:r>
+          </w:p>
+        </w:tc>
+        <w:tc>
+          <w:tcPr>
+            <w:tcW w:w="1100" w:type="dxa"/>
+            <w:vAlign w:val="center"/>
+          </w:tcPr>
+          <w:p>
+            <w:pPr>
+              <w:pStyle w:val="FinCell"/>
+              <w:jc w:val="center"/>
+            </w:pPr>
+            <w:r>
+              <w:t>20%</w:t>
+            </w:r>
+          </w:p>
+        </w:tc>
+      </w:tr>
+      <w:tr>
+        <w:trPr>
+          <w:cantSplit/>
+        </w:trPr>
+        <w:tc>
+          <w:tcPr>
+            <w:tcW w:w="2000" w:type="dxa"/>
+            <w:vAlign w:val="center"/>
+          </w:tcPr>
+          <w:p>
+            <w:pPr>
+              <w:pStyle w:val="FinCell"/>
+            </w:pPr>
+            <w:r>
+              <w:t>Lý Tú Nguyên</w:t>
+            </w:r>
+          </w:p>
+        </w:tc>
+        <w:tc>
+          <w:tcPr>
+            <w:tcW w:w="1250" w:type="dxa"/>
+            <w:vAlign w:val="center"/>
+          </w:tcPr>
+          <w:p>
+            <w:pPr>
+              <w:pStyle w:val="FinCell"/>
+              <w:jc w:val="center"/>
+            </w:pPr>
+            <w:r>
+              <w:t>24ITE067</w:t>
+            </w:r>
+          </w:p>
+        </w:tc>
+        <w:tc>
+          <w:tcPr>
+            <w:tcW w:w="4721" w:type="dxa"/>
+            <w:vAlign w:val="center"/>
+          </w:tcPr>
+          <w:p>
+            <w:pPr>
+              <w:pStyle w:val="FinCell"/>
+            </w:pPr>
+            <w:r>
+              <w:t>Phát triển Isolation Forest và phân loại TF-IDF, Logistic Regression; đánh giá cảnh báo và gợi ý danh mục.</w:t>
+            </w:r>
+          </w:p>
+        </w:tc>
+        <w:tc>
+          <w:tcPr>
+            <w:tcW w:w="1100" w:type="dxa"/>
+            <w:vAlign w:val="center"/>
+          </w:tcPr>
+          <w:p>
+            <w:pPr>
+              <w:pStyle w:val="FinCell"/>
+              <w:jc w:val="center"/>
+            </w:pPr>
+            <w:r>
+              <w:t>20%</w:t>
+            </w:r>
+          </w:p>
+        </w:tc>
+      </w:tr>
+      <w:tr>
+        <w:trPr>
+          <w:cantSplit/>
+        </w:trPr>
+        <w:tc>
+          <w:tcPr>
+            <w:tcW w:w="2000" w:type="dxa"/>
+            <w:vAlign w:val="center"/>
+          </w:tcPr>
+          <w:p>
+            <w:pPr>
+              <w:pStyle w:val="FinCell"/>
+            </w:pPr>
+            <w:r>
+              <w:t>Nguyễn Tùng Lâm</w:t>
+            </w:r>
+          </w:p>
+        </w:tc>
+        <w:tc>
+          <w:tcPr>
+            <w:tcW w:w="1250" w:type="dxa"/>
+            <w:vAlign w:val="center"/>
+          </w:tcPr>
+          <w:p>
+            <w:pPr>
+              <w:pStyle w:val="FinCell"/>
+              <w:jc w:val="center"/>
+            </w:pPr>
+            <w:r>
+              <w:t>24ITE055</w:t>
+            </w:r>
+          </w:p>
+        </w:tc>
+        <w:tc>
+          <w:tcPr>
+            <w:tcW w:w="4721" w:type="dxa"/>
+            <w:vAlign w:val="center"/>
+          </w:tcPr>
+          <w:p>
+            <w:pPr>
+              <w:pStyle w:val="FinCell"/>
+            </w:pPr>
+            <w:r>
+              <w:t>Tích hợp chat Qwen3; kiểm thử, triển khai và tổng hợp báo cáo, slide thuyết trình.</w:t>
+            </w:r>
+          </w:p>
+        </w:tc>
+        <w:tc>
+          <w:tcPr>
+            <w:tcW w:w="1100" w:type="dxa"/>
+            <w:vAlign w:val="center"/>
+          </w:tcPr>
+          <w:p>
+            <w:pPr>
+              <w:pStyle w:val="FinCell"/>
+              <w:jc w:val="center"/>
+            </w:pPr>
+            <w:r>
+              <w:t>20%</w:t>
+            </w:r>
+          </w:p>
+        </w:tc>
+      </w:tr>
+      <w:tr>
+        <w:trPr>
+          <w:cantSplit/>
+        </w:trPr>
+        <w:tc>
+          <w:tcPr>
+            <w:tcW w:w="2000" w:type="dxa"/>
+            <w:shd w:fill="F2F2F2"/>
+            <w:vAlign w:val="center"/>
+          </w:tcPr>
+          <w:p>
+            <w:pPr>
+              <w:pStyle w:val="FinCell"/>
+            </w:pPr>
+            <w:r>
+              <w:rPr>
+                <w:b/>
+              </w:rPr>
+              <w:t>Tổng cộng</w:t>
+            </w:r>
+          </w:p>
+        </w:tc>
+        <w:tc>
+          <w:tcPr>
+            <w:tcW w:w="1250" w:type="dxa"/>
+            <w:shd w:fill="F2F2F2"/>
+            <w:vAlign w:val="center"/>
+          </w:tcPr>
+          <w:p>
+            <w:pPr>
+              <w:pStyle w:val="FinCell"/>
+              <w:jc w:val="center"/>
+            </w:pPr>
+            <w:r>
+              <w:rPr>
+                <w:b/>
+              </w:rPr>
+              <w:t/>
+            </w:r>
+          </w:p>
+        </w:tc>
+        <w:tc>
+          <w:tcPr>
+            <w:tcW w:w="4721" w:type="dxa"/>
+            <w:shd w:fill="F2F2F2"/>
+            <w:vAlign w:val="center"/>
+          </w:tcPr>
+          <w:p>
+            <w:pPr>
+              <w:pStyle w:val="FinCell"/>
+            </w:pPr>
+            <w:r>
+              <w:rPr>
+                <w:b/>
+              </w:rPr>
+              <w:t>5 thành viên</w:t>
+            </w:r>
+          </w:p>
+        </w:tc>
+        <w:tc>
+          <w:tcPr>
+            <w:tcW w:w="1100" w:type="dxa"/>
+            <w:shd w:fill="F2F2F2"/>
+            <w:vAlign w:val="center"/>
+          </w:tcPr>
+          <w:p>
+            <w:pPr>
+              <w:pStyle w:val="FinCell"/>
+              <w:jc w:val="center"/>
+            </w:pPr>
+            <w:r>
+              <w:rPr>
+                <w:b/>
+              </w:rPr>
+              <w:t>100%</w:t>
+            </w:r>
+          </w:p>
+        </w:tc>
+      </w:tr>
+    </w:tbl>
+    <w:p>
+      <w:pPr>
+        <w:pStyle w:val="FinNote"/>
+        <w:spacing w:before="160" w:after="100"/>
+      </w:pPr>
+      <w:r>
+        <w:t>Tổng tỷ lệ phân chia công việc của nhóm là 100%.</w:t>
       </w:r>
     </w:p>
     <w:sectPr>

</xml_diff>